<commit_message>
Removed lot size related columns, updated data preprocessing
Updated pipeline to use only LotSizeSquareFeet; removed LotSizeAcres, LotSizeArea, and LotSizeUsedSqFt
</commit_message>
<xml_diff>
--- a/Week 3 Deliverable/Week3_Preprocessing_Summary_Report.docx
+++ b/Week 3 Deliverable/Week3_Preprocessing_Summary_Report.docx
@@ -5,107 +5,26 @@
     <w:p>
       <w:pPr>
         <w:spacing w:after="0"/>
-        <w:rPr>
-          <w:b/>
-          <w:color w:val="0B2545"/>
-          <w:sz w:val="36"/>
-        </w:rPr>
       </w:pPr>
       <w:r>
         <w:rPr>
           <w:b/>
           <w:color w:val="0B2545"/>
-          <w:sz w:val="36"/>
+          <w:sz w:val="34"/>
         </w:rPr>
         <w:t>Week 3 Preprocessing Summary Report</w:t>
       </w:r>
     </w:p>
     <w:p>
       <w:pPr>
-        <w:spacing w:after="0"/>
-        <w:rPr>
-          <w:sz w:val="28"/>
-          <w:szCs w:val="20"/>
-        </w:rPr>
-      </w:pPr>
-      <w:r>
-        <w:rPr>
-          <w:b/>
-          <w:color w:val="0B2545"/>
-          <w:sz w:val="28"/>
-          <w:szCs w:val="20"/>
-        </w:rPr>
-        <w:t>Beini Lan | Team ds55</w:t>
-      </w:r>
-    </w:p>
-    <w:p>
-      <w:pPr>
-        <w:spacing w:after="100"/>
+        <w:spacing w:after="80"/>
       </w:pPr>
       <w:r>
         <w:rPr>
           <w:color w:val="5A5A5A"/>
-          <w:sz w:val="19"/>
+          <w:sz w:val="18"/>
         </w:rPr>
-        <w:t>Deliverables: 02_</w:t>
-      </w:r>
-      <w:proofErr w:type="gramStart"/>
-      <w:r>
-        <w:rPr>
-          <w:color w:val="5A5A5A"/>
-          <w:sz w:val="19"/>
-        </w:rPr>
-        <w:t>preprocessing.ipynb</w:t>
-      </w:r>
-      <w:proofErr w:type="gramEnd"/>
-      <w:r>
-        <w:rPr>
-          <w:color w:val="5A5A5A"/>
-          <w:sz w:val="19"/>
-        </w:rPr>
-        <w:t>, 02_preprocessing.py</w:t>
-      </w:r>
-      <w:r>
-        <w:rPr>
-          <w:color w:val="5A5A5A"/>
-          <w:sz w:val="19"/>
-        </w:rPr>
-        <w:t xml:space="preserve"> (contains helper functions and main)</w:t>
-      </w:r>
-      <w:r>
-        <w:rPr>
-          <w:color w:val="5A5A5A"/>
-          <w:sz w:val="19"/>
-        </w:rPr>
-        <w:t>, cleaned SFR CRMLS CSV</w:t>
-      </w:r>
-      <w:r>
-        <w:rPr>
-          <w:color w:val="5A5A5A"/>
-          <w:sz w:val="19"/>
-        </w:rPr>
-        <w:t xml:space="preserve"> (file: </w:t>
-      </w:r>
-      <w:r>
-        <w:rPr>
-          <w:color w:val="5A5A5A"/>
-          <w:sz w:val="19"/>
-        </w:rPr>
-        <w:t>cleaned_crmls_sfr_train_test.csv</w:t>
-      </w:r>
-      <w:r>
-        <w:rPr>
-          <w:color w:val="5A5A5A"/>
-          <w:sz w:val="19"/>
-        </w:rPr>
-        <w:t>)</w:t>
-      </w:r>
-      <w:r>
-        <w:rPr>
-          <w:color w:val="5A5A5A"/>
-          <w:sz w:val="19"/>
-        </w:rPr>
-        <w:t>, and this documentation file</w:t>
+        <w:t>Updated cleaning decision: use only LotSizeSquareFeet for lot size; do not derive or retain LotSizeAcres, LotSizeArea, or LotSizeUsedSqFt.</w:t>
       </w:r>
     </w:p>
     <w:p>
@@ -116,123 +35,7 @@
         <w:t xml:space="preserve">Scope: </w:t>
       </w:r>
       <w:r>
-        <w:t xml:space="preserve">This report summarizes the Week 3 preprocessing </w:t>
-      </w:r>
-      <w:r>
-        <w:t>work</w:t>
-      </w:r>
-      <w:r>
-        <w:t>. The pipeline uses Residential + SingleFamilyResidence records from May 2025 through May 2026 and excludes leaky list-price fields.</w:t>
-      </w:r>
-    </w:p>
-    <w:p>
-      <w:pPr>
-        <w:pStyle w:val="Heading2"/>
-        <w:rPr>
-          <w:lang w:eastAsia="zh-CN"/>
-        </w:rPr>
-      </w:pPr>
-      <w:r>
-        <w:rPr>
-          <w:rFonts w:ascii="Calibri" w:hAnsi="Calibri"/>
-        </w:rPr>
-        <w:t>1. Missing values: handling and reasoning</w:t>
-      </w:r>
-    </w:p>
-    <w:p>
-      <w:pPr>
-        <w:pStyle w:val="ListBullet"/>
-      </w:pPr>
-      <w:r>
-        <w:t xml:space="preserve">Rows with missing or non-positive </w:t>
-      </w:r>
-      <w:r>
-        <w:rPr>
-          <w:b/>
-          <w:bCs/>
-        </w:rPr>
-        <w:t>ClosePrice</w:t>
-      </w:r>
-      <w:r>
-        <w:t xml:space="preserve"> were removed because </w:t>
-      </w:r>
-      <w:r>
-        <w:rPr>
-          <w:b/>
-          <w:bCs/>
-        </w:rPr>
-        <w:t>ClosePrice</w:t>
-      </w:r>
-      <w:r>
-        <w:t xml:space="preserve"> is the target variable; keeping those rows would not help supervised model training.</w:t>
-      </w:r>
-    </w:p>
-    <w:p>
-      <w:pPr>
-        <w:pStyle w:val="ListBullet"/>
-      </w:pPr>
-      <w:r>
-        <w:t xml:space="preserve">Invalid values were converted to </w:t>
-      </w:r>
-      <w:r>
-        <w:rPr>
-          <w:u w:val="single"/>
-        </w:rPr>
-        <w:t>missing</w:t>
-      </w:r>
-      <w:r>
-        <w:t xml:space="preserve"> before imputation: zero living area, zero beds/baths, zero lot size, negative days on market, out-of-California coordinates, and implausible parking or garage counts.</w:t>
-      </w:r>
-    </w:p>
-    <w:p>
-      <w:pPr>
-        <w:pStyle w:val="ListBullet"/>
-      </w:pPr>
-      <w:r>
-        <w:t xml:space="preserve">Numeric predictors were </w:t>
-      </w:r>
-      <w:r>
-        <w:rPr>
-          <w:u w:val="single"/>
-        </w:rPr>
-        <w:t>median</w:t>
-      </w:r>
-      <w:r>
-        <w:t xml:space="preserve"> imputed</w:t>
-      </w:r>
-      <w:r>
-        <w:t xml:space="preserve"> using training rows only, then paired with missingness flags such as LivingArea_missing and AssociationFee_missing so future models can learn whether missingness itself carries </w:t>
-      </w:r>
-      <w:r>
-        <w:rPr>
-          <w:lang w:eastAsia="zh-CN"/>
-        </w:rPr>
-        <w:t>impact on prediction modeling</w:t>
-      </w:r>
-      <w:r>
-        <w:t>.</w:t>
-      </w:r>
-    </w:p>
-    <w:p>
-      <w:pPr>
-        <w:pStyle w:val="ListBullet"/>
-      </w:pPr>
-      <w:r>
-        <w:t>Boolean fields were converted to flags and missing booleans were filled as 0, with separate missingness indicators retained to avoid pretending missing values are identical to observed false values.</w:t>
-      </w:r>
-    </w:p>
-    <w:p>
-      <w:pPr>
-        <w:pStyle w:val="ListBullet"/>
-      </w:pPr>
-      <w:r>
-        <w:t xml:space="preserve">FireplacesTotal was dropped because it was fully missing in the filtered </w:t>
-      </w:r>
-      <w:r>
-        <w:t>Week 2 v2</w:t>
-      </w:r>
-      <w:r>
-        <w:t xml:space="preserve"> dataset, so it could not provide useful signal for this preprocessing stage.</w:t>
+        <w:t>This report documents the Week 3 preprocessing updates for the California SFR close-price dataset. The pipeline reads the 13 monthly CRMLSSold files, filters to Residential + SingleFamilyResidence, creates a May 2026 holdout set, and writes one cleaned modeling CSV.</w:t>
       </w:r>
     </w:p>
     <w:p>
@@ -243,19 +46,7 @@
         <w:rPr>
           <w:rFonts w:ascii="Calibri" w:hAnsi="Calibri"/>
         </w:rPr>
-        <w:t xml:space="preserve">2. Categorical </w:t>
-      </w:r>
-      <w:r>
-        <w:rPr>
-          <w:rFonts w:ascii="Calibri" w:hAnsi="Calibri"/>
-        </w:rPr>
-        <w:t>variable</w:t>
-      </w:r>
-      <w:r>
-        <w:rPr>
-          <w:rFonts w:ascii="Calibri" w:hAnsi="Calibri"/>
-        </w:rPr>
-        <w:t xml:space="preserve"> encoding</w:t>
+        <w:t>1. Missing values</w:t>
       </w:r>
     </w:p>
     <w:p>
@@ -263,7 +54,7 @@
         <w:pStyle w:val="ListBullet"/>
       </w:pPr>
       <w:r>
-        <w:t>CountyOrParish was one-hot encoded using categories observed in the training window only. This prevents the May 2026 test set from influencing the feature space.</w:t>
+        <w:t>Target rule: rows with missing or non-positive ClosePrice were removed because ClosePrice is the supervised learning target.</w:t>
       </w:r>
     </w:p>
     <w:p>
@@ -271,7 +62,7 @@
         <w:pStyle w:val="ListBullet"/>
       </w:pPr>
       <w:r>
-        <w:t>PostalCode was frequency-encoded from the training data because ZIP code has high cardinality. One-hot encoding every ZIP would create thousands of sparse columns and make early models harder to manage.</w:t>
+        <w:t>Numeric rule: missing values are median-imputed using training rows only, then paired with missingness flags so models can learn whether missingness carries signal.</w:t>
       </w:r>
     </w:p>
     <w:p>
@@ -279,7 +70,7 @@
         <w:pStyle w:val="ListBullet"/>
       </w:pPr>
       <w:r>
-        <w:t>Unseen or missing ZIP codes in the May 2026 test set map to 0 frequency, and a PostalCode_missing flag is retained.</w:t>
+        <w:t>Lot-size rule: only LotSizeSquareFeet is used. Missing, zero, or negative LotSizeSquareFeet is treated as missing and imputed; LotSizeAcres and LotSizeArea are dropped to avoid mixed definitions and duplicate representations of the same concept.</w:t>
       </w:r>
     </w:p>
     <w:p>
@@ -287,7 +78,15 @@
         <w:pStyle w:val="ListBullet"/>
       </w:pPr>
       <w:r>
-        <w:t>NewConstructionYN, PoolPrivateYN, ViewYN, and WaterfrontYN were mapped to numeric flags: true/yes = 1 and false/no/missing = 0, with missing flags kept separately.</w:t>
+        <w:t>Boolean rule: true/false fields become 1/0 flags, while separate missing flags preserve the information that a value was absent.</w:t>
+      </w:r>
+    </w:p>
+    <w:p>
+      <w:pPr>
+        <w:pStyle w:val="ListBullet"/>
+      </w:pPr>
+      <w:r>
+        <w:t>Column-drop rule: FireplacesTotal remains dropped because it was fully missing in the filtered Week 2 v2 dataset and would add no usable model signal.</w:t>
       </w:r>
     </w:p>
     <w:p>
@@ -298,7 +97,7 @@
         <w:rPr>
           <w:rFonts w:ascii="Calibri" w:hAnsi="Calibri"/>
         </w:rPr>
-        <w:t>3. Numerical normalization and median imputation</w:t>
+        <w:t>2. Review of imputation, dropped columns, and outliers</w:t>
       </w:r>
     </w:p>
     <w:p>
@@ -306,16 +105,7 @@
         <w:pStyle w:val="ListBullet"/>
       </w:pPr>
       <w:r>
-        <w:t xml:space="preserve">All numerical model features were standardized with </w:t>
-      </w:r>
-      <w:r>
-        <w:rPr>
-          <w:u w:val="single"/>
-        </w:rPr>
-        <w:t>z-scores</w:t>
-      </w:r>
-      <w:r>
-        <w:t xml:space="preserve"> fit on training rows only, then applied to both train and test rows to avoid test-set leakage.</w:t>
+        <w:t>Median imputation pros: robust to skew and outliers common in real estate, easy to explain, and fit only on training data to avoid leakage. Cons: it can reduce variance and may hide neighborhood-specific patterns that a later grouped imputer could capture.</w:t>
       </w:r>
     </w:p>
     <w:p>
@@ -323,22 +113,7 @@
         <w:pStyle w:val="ListBullet"/>
       </w:pPr>
       <w:r>
-        <w:t xml:space="preserve">LotSizeUsedSqFt, DaysOnMarket, and AssociationFee were transformed with </w:t>
-      </w:r>
-      <w:r>
-        <w:rPr>
-          <w:u w:val="single"/>
-        </w:rPr>
-        <w:t>log1p</w:t>
-      </w:r>
-      <w:r>
-        <w:t xml:space="preserve"> before scaling because their Week 2 distributions were strongly </w:t>
-      </w:r>
-      <w:r>
-        <w:t>right skewed</w:t>
-      </w:r>
-      <w:r>
-        <w:t xml:space="preserve"> with long tails.</w:t>
+        <w:t>Dropping extra lot variables pros: cleaner feature matrix, less multicollinearity, and one consistent square-foot unit for modeling. Cons: if LotSizeSquareFeet is missing while acres/area is populated, that record loses a possible fallback source.</w:t>
       </w:r>
     </w:p>
     <w:p>
@@ -346,7 +121,7 @@
         <w:pStyle w:val="ListBullet"/>
       </w:pPr>
       <w:r>
-        <w:t>Median imputation was selected instead of mean imputation because real-estate variables are skewed: luxury prices, very large lots, unusually long days on market, and high association fees can pull means away from a typical property.</w:t>
+        <w:t>Outlier-to-missing rule pros: impossible values such as zero living area, negative days on market, invalid California coordinates, and implausible parking counts are prevented from distorting scaling. Cons: some rare but valid luxury or rural properties may be simplified if an aggressive threshold is used.</w:t>
       </w:r>
     </w:p>
     <w:p>
@@ -354,13 +129,7 @@
         <w:pStyle w:val="ListBullet"/>
       </w:pPr>
       <w:r>
-        <w:t>Median imputation is robust to those outliers and keeps the preprocessing simple and reproducible for the</w:t>
-      </w:r>
-      <w:r>
-        <w:t xml:space="preserve"> </w:t>
-      </w:r>
-      <w:r>
-        <w:t>Week 4 baseline model.</w:t>
+        <w:t>Current balance: keep true rows, flag missingness, and use conservative invalid-value rules rather than dropping many records, so the Week 4 baseline has enough training data.</w:t>
       </w:r>
     </w:p>
     <w:p>
@@ -371,19 +140,7 @@
         <w:rPr>
           <w:rFonts w:ascii="Calibri" w:hAnsi="Calibri"/>
         </w:rPr>
-        <w:t xml:space="preserve">4. Train/test split and optimal X-month </w:t>
-      </w:r>
-      <w:r>
-        <w:rPr>
-          <w:rFonts w:ascii="Calibri" w:hAnsi="Calibri"/>
-        </w:rPr>
-        <w:t xml:space="preserve">training </w:t>
-      </w:r>
-      <w:r>
-        <w:rPr>
-          <w:rFonts w:ascii="Calibri" w:hAnsi="Calibri"/>
-        </w:rPr>
-        <w:t>window</w:t>
+        <w:t>3. Categorical encoding</w:t>
       </w:r>
     </w:p>
     <w:p>
@@ -391,23 +148,7 @@
         <w:pStyle w:val="ListBullet"/>
       </w:pPr>
       <w:r>
-        <w:t xml:space="preserve">The most recent available month, </w:t>
-      </w:r>
-      <w:r>
-        <w:rPr>
-          <w:b/>
-          <w:bCs/>
-        </w:rPr>
-        <w:t>May 2026</w:t>
-      </w:r>
-      <w:r>
-        <w:t xml:space="preserve">, was </w:t>
-      </w:r>
-      <w:r>
-        <w:t>chosen</w:t>
-      </w:r>
-      <w:r>
-        <w:t xml:space="preserve"> as the test set, producing 12,024 test rows.</w:t>
+        <w:t>CountyOrParish is one-hot encoded using categories observed in the training window only, preventing May 2026 test data from shaping the feature space.</w:t>
       </w:r>
     </w:p>
     <w:p>
@@ -415,7 +156,7 @@
         <w:pStyle w:val="ListBullet"/>
       </w:pPr>
       <w:r>
-        <w:t>Candidate training windows were compared using the X months immediately before May 2026: X = 3, 6, 9, and 12.</w:t>
+        <w:t>PostalCode is frequency-encoded from training data because ZIP code has high cardinality; this avoids thousands of sparse one-hot columns for the baseline stage.</w:t>
       </w:r>
     </w:p>
     <w:p>
@@ -423,7 +164,7 @@
         <w:pStyle w:val="ListBullet"/>
       </w:pPr>
       <w:r>
-        <w:t>The experiment compared sample size, median-price drift versus May 2026, interquartile-range drift, county coverage, ZIP-code coverage, and average feature missingness.</w:t>
+        <w:t>Unseen or missing ZIPs map to 0 frequency, and PostalCode_missing is retained.</w:t>
       </w:r>
     </w:p>
     <w:p>
@@ -431,32 +172,7 @@
         <w:pStyle w:val="ListBullet"/>
       </w:pPr>
       <w:r>
-        <w:rPr>
-          <w:b/>
-          <w:bCs/>
-        </w:rPr>
-        <w:lastRenderedPageBreak/>
-        <w:t>X = 12 was chosen as the optimal preprocessing window</w:t>
-      </w:r>
-      <w:r>
-        <w:t>: it uses May 2025 through April 2026, gives the largest training set at 129,972 rows, preserves a full seasonal cycle, reaches 100% county coverage, and gives the strongest ZIP coverage at 99.33%.</w:t>
-      </w:r>
-    </w:p>
-    <w:p>
-      <w:pPr>
-        <w:pStyle w:val="ListBullet"/>
-      </w:pPr>
-      <w:r>
-        <w:t>Although X = 3 had slightly lower price-distribution drift, it had only 31,758 training rows and weaker ZIP coverage, so it was less reliable for a general</w:t>
-      </w:r>
-      <w:r>
-        <w:t xml:space="preserve">izable </w:t>
-      </w:r>
-      <w:r>
-        <w:t>prediction</w:t>
-      </w:r>
-      <w:r>
-        <w:t xml:space="preserve"> model.</w:t>
+        <w:t>NewConstructionYN, PoolPrivateYN, ViewYN, and WaterfrontYN are encoded as true/yes = 1 and false/no/missing = 0, with separate missing indicators.</w:t>
       </w:r>
     </w:p>
     <w:p>
@@ -467,7 +183,86 @@
         <w:rPr>
           <w:rFonts w:ascii="Calibri" w:hAnsi="Calibri"/>
         </w:rPr>
-        <w:t>Key findings and next-week direction</w:t>
+        <w:t>4. Numerical normalization</w:t>
+      </w:r>
+    </w:p>
+    <w:p>
+      <w:pPr>
+        <w:pStyle w:val="ListBullet"/>
+      </w:pPr>
+      <w:r>
+        <w:t>All numeric features are standardized with z-scores fit on training rows only and applied to both train and test rows.</w:t>
+      </w:r>
+    </w:p>
+    <w:p>
+      <w:pPr>
+        <w:pStyle w:val="ListBullet"/>
+      </w:pPr>
+      <w:r>
+        <w:t>LotSizeSquareFeet, DaysOnMarket, and AssociationFee use log1p before z-score scaling because their distributions are right-skewed with long tails.</w:t>
+      </w:r>
+    </w:p>
+    <w:p>
+      <w:pPr>
+        <w:pStyle w:val="ListBullet"/>
+      </w:pPr>
+      <w:r>
+        <w:t>Median was chosen over mean because lot size, days on market, association fees, and other real-estate fields can have extreme values that pull the mean away from a typical property.</w:t>
+      </w:r>
+    </w:p>
+    <w:p>
+      <w:pPr>
+        <w:pStyle w:val="Heading2"/>
+      </w:pPr>
+      <w:r>
+        <w:rPr>
+          <w:rFonts w:ascii="Calibri" w:hAnsi="Calibri"/>
+        </w:rPr>
+        <w:t>5. Train/test split and X-month experiment</w:t>
+      </w:r>
+    </w:p>
+    <w:p>
+      <w:pPr>
+        <w:pStyle w:val="ListBullet"/>
+      </w:pPr>
+      <w:r>
+        <w:t>May 2026 is fixed as the test month, producing 12,024 holdout rows.</w:t>
+      </w:r>
+    </w:p>
+    <w:p>
+      <w:pPr>
+        <w:pStyle w:val="ListBullet"/>
+      </w:pPr>
+      <w:r>
+        <w:t>Candidate training windows used the months immediately before May 2026: X = 3, 6, 9, and 12.</w:t>
+      </w:r>
+    </w:p>
+    <w:p>
+      <w:pPr>
+        <w:pStyle w:val="ListBullet"/>
+      </w:pPr>
+      <w:r>
+        <w:lastRenderedPageBreak/>
+        <w:t>The comparison considered train-row count, median-price drift, IQR drift, county coverage, ZIP coverage, and feature missingness.</w:t>
+      </w:r>
+    </w:p>
+    <w:p>
+      <w:pPr>
+        <w:pStyle w:val="ListBullet"/>
+      </w:pPr>
+      <w:r>
+        <w:t>X = 12 was selected: May 2025-April 2026 gives 129,972 training rows, a full seasonal cycle, 100% county coverage, and the best ZIP coverage at 99.33%. X = 3 had slightly lower distribution drift but only 31,758 training rows and weaker ZIP coverage.</w:t>
+      </w:r>
+    </w:p>
+    <w:p>
+      <w:pPr>
+        <w:pStyle w:val="Heading2"/>
+      </w:pPr>
+      <w:r>
+        <w:rPr>
+          <w:rFonts w:ascii="Calibri" w:hAnsi="Calibri"/>
+        </w:rPr>
+        <w:t>Key findings</w:t>
       </w:r>
     </w:p>
     <w:p>
@@ -481,30 +276,35 @@
         <w:rPr>
           <w:highlight w:val="yellow"/>
         </w:rPr>
-        <w:t>The cleaned modeling CSV has 141,996 rows, 99 columns, 93 numeric feature columns, zero missing feature values, and no non-numeric feature columns in the model matrix.</w:t>
+        <w:t xml:space="preserve">The refreshed cleaned CSV has 141,996 rows, 99 columns, 93 numeric feature columns, zero missing feature values, and only two lot-size model columns: </w:t>
       </w:r>
-    </w:p>
-    <w:p>
-      <w:pPr>
-        <w:pStyle w:val="ListBullet"/>
-        <w:rPr>
-          <w:u w:val="single"/>
-        </w:rPr>
-      </w:pPr>
-      <w:r>
-        <w:t xml:space="preserve">The Week 4 baseline </w:t>
-      </w:r>
-      <w:r>
-        <w:t>model</w:t>
-      </w:r>
-      <w:r>
-        <w:t xml:space="preserve"> can train Linear Regression directly from the cleaned CSV </w:t>
-      </w:r>
+      <w:proofErr w:type="spellStart"/>
       <w:r>
         <w:rPr>
-          <w:u w:val="single"/>
+          <w:highlight w:val="yellow"/>
         </w:rPr>
-        <w:t>using Split == train for May 2025-April 2026 and Split == test for May 2026.</w:t>
+        <w:t>LotSizeSquareFeet_missing</w:t>
+      </w:r>
+      <w:proofErr w:type="spellEnd"/>
+      <w:r>
+        <w:rPr>
+          <w:highlight w:val="yellow"/>
+        </w:rPr>
+        <w:t xml:space="preserve"> and </w:t>
+      </w:r>
+      <w:proofErr w:type="spellStart"/>
+      <w:r>
+        <w:rPr>
+          <w:highlight w:val="yellow"/>
+        </w:rPr>
+        <w:t>LotSizeSquareFeet_log_z</w:t>
+      </w:r>
+      <w:proofErr w:type="spellEnd"/>
+      <w:r>
+        <w:rPr>
+          <w:highlight w:val="yellow"/>
+        </w:rPr>
+        <w:t>.</w:t>
       </w:r>
     </w:p>
     <w:p>
@@ -512,13 +312,33 @@
         <w:pStyle w:val="ListBullet"/>
       </w:pPr>
       <w:r>
-        <w:t>Future modeling should monitor whether log-transformed skewed fields, ZIP frequency encoding, and missingness flags improve R-squared and error metrics compared with simpler preprocessing variants.</w:t>
+        <w:t>Week 4 can train Linear Regression directly from Split == train and evaluate on Split == test.</w:t>
+      </w:r>
+    </w:p>
+    <w:p>
+      <w:pPr>
+        <w:spacing w:before="60"/>
+      </w:pPr>
+      <w:r>
+        <w:rPr>
+          <w:b/>
+        </w:rPr>
+        <w:t xml:space="preserve">Output: </w:t>
+      </w:r>
+      <w:r>
+        <w:t xml:space="preserve">Cleaned CSV saved </w:t>
+      </w:r>
+      <w:r>
+        <w:t xml:space="preserve">as </w:t>
+      </w:r>
+      <w:r>
+        <w:t>cleaned_crmls_sfr_train_test.csv.</w:t>
       </w:r>
     </w:p>
     <w:sectPr>
       <w:footerReference w:type="default" r:id="rId8"/>
       <w:pgSz w:w="12240" w:h="15840"/>
-      <w:pgMar w:top="1224" w:right="1224" w:bottom="1224" w:left="1224" w:header="708" w:footer="708" w:gutter="0"/>
+      <w:pgMar w:top="1152" w:right="1224" w:bottom="1152" w:left="1224" w:header="708" w:footer="708" w:gutter="0"/>
       <w:cols w:space="720"/>
       <w:docGrid w:linePitch="360"/>
     </w:sectPr>
@@ -563,35 +383,7 @@
         <w:color w:val="646464"/>
         <w:sz w:val="16"/>
       </w:rPr>
-      <w:t>IDX Exchange</w:t>
-    </w:r>
-    <w:r>
-      <w:rPr>
-        <w:color w:val="646464"/>
-        <w:sz w:val="16"/>
-      </w:rPr>
-      <w:t xml:space="preserve"> Summer Internship Team</w:t>
-    </w:r>
-    <w:r>
-      <w:rPr>
-        <w:color w:val="646464"/>
-        <w:sz w:val="16"/>
-      </w:rPr>
-      <w:t xml:space="preserve"> </w:t>
-    </w:r>
-    <w:r>
-      <w:rPr>
-        <w:color w:val="646464"/>
-        <w:sz w:val="16"/>
-      </w:rPr>
-      <w:t>ds</w:t>
-    </w:r>
-    <w:r>
-      <w:rPr>
-        <w:color w:val="646464"/>
-        <w:sz w:val="16"/>
-      </w:rPr>
-      <w:t>55 | Week 3 Preprocessing Summary</w:t>
+      <w:t>IDX Exchange DS55 | Week 3 Preprocessing Summary</w:t>
     </w:r>
   </w:p>
 </w:ftr>
@@ -795,31 +587,31 @@
       </w:rPr>
     </w:lvl>
   </w:abstractNum>
-  <w:num w:numId="1" w16cid:durableId="168250904">
+  <w:num w:numId="1" w16cid:durableId="1364667997">
     <w:abstractNumId w:val="8"/>
   </w:num>
-  <w:num w:numId="2" w16cid:durableId="280232741">
+  <w:num w:numId="2" w16cid:durableId="1073355746">
     <w:abstractNumId w:val="6"/>
   </w:num>
-  <w:num w:numId="3" w16cid:durableId="1466311008">
+  <w:num w:numId="3" w16cid:durableId="1258640465">
     <w:abstractNumId w:val="5"/>
   </w:num>
-  <w:num w:numId="4" w16cid:durableId="282154414">
+  <w:num w:numId="4" w16cid:durableId="1169443805">
     <w:abstractNumId w:val="4"/>
   </w:num>
-  <w:num w:numId="5" w16cid:durableId="228032000">
+  <w:num w:numId="5" w16cid:durableId="1136490167">
     <w:abstractNumId w:val="7"/>
   </w:num>
-  <w:num w:numId="6" w16cid:durableId="936445299">
+  <w:num w:numId="6" w16cid:durableId="2052149287">
     <w:abstractNumId w:val="3"/>
   </w:num>
-  <w:num w:numId="7" w16cid:durableId="635723677">
+  <w:num w:numId="7" w16cid:durableId="856622820">
     <w:abstractNumId w:val="2"/>
   </w:num>
-  <w:num w:numId="8" w16cid:durableId="1685790248">
+  <w:num w:numId="8" w16cid:durableId="258611082">
     <w:abstractNumId w:val="1"/>
   </w:num>
-  <w:num w:numId="9" w16cid:durableId="1371035241">
+  <w:num w:numId="9" w16cid:durableId="578952924">
     <w:abstractNumId w:val="0"/>
   </w:num>
 </w:numbering>
@@ -1216,11 +1008,11 @@
     <w:qFormat/>
     <w:rsid w:val="00FC693F"/>
     <w:pPr>
-      <w:spacing w:after="60" w:line="259" w:lineRule="auto"/>
+      <w:spacing w:after="50" w:line="252" w:lineRule="auto"/>
     </w:pPr>
     <w:rPr>
       <w:rFonts w:ascii="Calibri" w:hAnsi="Calibri"/>
-      <w:sz w:val="21"/>
+      <w:sz w:val="20"/>
     </w:rPr>
   </w:style>
   <w:style w:type="paragraph" w:styleId="Heading1">
@@ -1234,7 +1026,7 @@
     <w:pPr>
       <w:keepNext/>
       <w:keepLines/>
-      <w:spacing w:before="200" w:after="80"/>
+      <w:spacing w:before="160" w:after="60"/>
       <w:outlineLvl w:val="0"/>
     </w:pPr>
     <w:rPr>
@@ -1242,7 +1034,7 @@
       <w:b/>
       <w:bCs/>
       <w:color w:val="2E74B5"/>
-      <w:sz w:val="30"/>
+      <w:sz w:val="29"/>
       <w:szCs w:val="28"/>
     </w:rPr>
   </w:style>
@@ -1258,7 +1050,7 @@
     <w:pPr>
       <w:keepNext/>
       <w:keepLines/>
-      <w:spacing w:before="140"/>
+      <w:spacing w:before="120" w:after="40"/>
       <w:outlineLvl w:val="1"/>
     </w:pPr>
     <w:rPr>
@@ -1266,7 +1058,7 @@
       <w:b/>
       <w:bCs/>
       <w:color w:val="2E74B5"/>
-      <w:sz w:val="25"/>
+      <w:sz w:val="24"/>
       <w:szCs w:val="26"/>
     </w:rPr>
   </w:style>
@@ -1282,7 +1074,7 @@
     <w:pPr>
       <w:keepNext/>
       <w:keepLines/>
-      <w:spacing w:before="100" w:after="40"/>
+      <w:spacing w:before="80" w:after="40"/>
       <w:outlineLvl w:val="2"/>
     </w:pPr>
     <w:rPr>
@@ -1290,7 +1082,7 @@
       <w:b/>
       <w:bCs/>
       <w:color w:val="1F4D78"/>
-      <w:sz w:val="23"/>
+      <w:sz w:val="22"/>
     </w:rPr>
   </w:style>
   <w:style w:type="paragraph" w:styleId="Heading4">
@@ -1404,7 +1196,6 @@
     <w:rPr>
       <w:rFonts w:asciiTheme="majorHAnsi" w:eastAsiaTheme="majorEastAsia" w:hAnsiTheme="majorHAnsi" w:cstheme="majorBidi"/>
       <w:color w:val="4F81BD" w:themeColor="accent1"/>
-      <w:sz w:val="20"/>
       <w:szCs w:val="20"/>
     </w:rPr>
   </w:style>
@@ -1429,7 +1220,6 @@
       <w:i/>
       <w:iCs/>
       <w:color w:val="404040" w:themeColor="text1" w:themeTint="BF"/>
-      <w:sz w:val="20"/>
       <w:szCs w:val="20"/>
     </w:rPr>
   </w:style>
@@ -1750,7 +1540,7 @@
       <w:numPr>
         <w:numId w:val="1"/>
       </w:numPr>
-      <w:spacing w:after="40" w:line="254" w:lineRule="auto"/>
+      <w:spacing w:after="36" w:line="250" w:lineRule="auto"/>
       <w:ind w:left="461" w:hanging="259"/>
       <w:contextualSpacing/>
     </w:pPr>

</xml_diff>